<commit_message>
Pivot to a multi-roaster bean marketplace (Souk Al-Bunn) for the UAE
Rework the business plan and add a bilingual (EN/AR, RTL) storefront
prototype: reselling curated beans from independent UAE roasters
rather than house-roasting, in AED, one-off purchases only, no
brewing-essentials line. The storefront's signature feature is a
roast-degree spectrum that places every partner roaster's bean on
one comparable scale, plus a client-side demo bag/checkout flow.

Co-Authored-By: Claude Sonnet 5 <noreply@anthropic.com>
Claude-Session: https://claude.ai/code/session_0181vg14DwgGRqcbNg1k5Gbf
</commit_message>
<xml_diff>
--- a/docs/business-plan.docx
+++ b/docs/business-plan.docx
@@ -36,7 +36,7 @@
           <w:sz w:val="64"/>
           <w:szCs w:val="64"/>
         </w:rPr>
-        <w:t xml:space="preserve">Roast &amp; Ritual Coffee Co.</w:t>
+        <w:t xml:space="preserve">Souk Al-Bunn</w:t>
       </w:r>
     </w:p>
     <w:p>
@@ -52,7 +52,7 @@
           <w:sz w:val="24"/>
           <w:szCs w:val="24"/>
         </w:rPr>
-        <w:t xml:space="preserve">Specialty Coffee Beans &amp; Brewing Essentials, Sold Online</w:t>
+        <w:t xml:space="preserve">A Curated Online Marketplace for Specialty Coffee Beans — UAE</w:t>
       </w:r>
     </w:p>
     <w:p>
@@ -119,7 +119,7 @@
           <w:sz w:val="21"/>
           <w:szCs w:val="21"/>
         </w:rPr>
-        <w:t xml:space="preserve">Roast &amp; Ritual Coffee Co. (working name — replace with your chosen brand) is a direct-to-consumer online business selling specialty coffee beans alongside a curated line of “coffee essentials”: grinders, pour-over brewers, filters, scales, and storage. The business sources green or roasted beans from a small number of trusted origins/roasters, builds a simple e-commerce storefront, and grows through subscriptions and content-led marketing (brewing guides, origin stories, tasting notes).</w:t>
+        <w:t xml:space="preserve">Souk Al-Bunn (working name — Arabic for “the coffee bean market”; replace once a final brand is chosen) is an online marketplace that curates and resells specialty coffee beans from independent roasters across the UAE. Rather than roasting its own coffee, the business buys wholesale (or sells on consignment) from a growing roster of local roasters, lists their beans side by side on a single bilingual (English/Arabic) storefront, and ships every order from one warehouse — so a customer mixing beans from three different roasters still gets one delivery.</w:t>
       </w:r>
     </w:p>
     <w:p>
@@ -132,7 +132,7 @@
           <w:sz w:val="21"/>
           <w:szCs w:val="21"/>
         </w:rPr>
-        <w:t xml:space="preserve">The plan below is written in three budget tiers — Lean (under $5,000), Moderate ($5,000–$25,000), and Growth ($25,000–$100,000) — since the exact starting capital wasn't fixed yet. Start at the tier that matches available cash, and treat the next tier up as the 12–18 month target once revenue validates demand.</w:t>
+        <w:t xml:space="preserve">This model — closer to Trade Coffee (US) or Spresso (UAE) than to a single-brand roastery — trades manufacturing complexity (no roasting equipment, no house recipe risk) for curation and logistics as the core skill. The differentiator is comparison: every bean is placed on the same roast-degree scale with consistent tasting notes and pricing, so customers pick by taste rather than by which roaster has the best Instagram.</w:t>
       </w:r>
     </w:p>
     <w:p>
@@ -145,7 +145,7 @@
           <w:sz w:val="21"/>
           <w:szCs w:val="21"/>
         </w:rPr>
-        <w:t xml:space="preserve">Core thesis: coffee beans alone are a low-margin, repeat-purchase commodity; bundling them with essentials and a subscription raises average order value and lifetime value enough to justify paid acquisition and to build a defensible, story-driven brand rather than competing purely on price.</w:t>
+        <w:t xml:space="preserve">The plan below is written in three budget tiers — Lean (under AED 20,000), Moderate (AED 20,000–90,000), and Growth (AED 90,000–350,000) — since the exact starting capital wasn't fixed yet. Start at the tier that matches available cash; treat the next tier up as the 12–18 month target once demand is validated.</w:t>
       </w:r>
     </w:p>
     <w:p>
@@ -193,7 +193,7 @@
           <w:sz w:val="21"/>
           <w:szCs w:val="21"/>
         </w:rPr>
-        <w:t xml:space="preserve">Make excellent, traceable coffee simple to brew well at home — by pairing freshly roasted beans with the exact tools needed to get a great cup, and teaching customers how to use them.</w:t>
+        <w:t xml:space="preserve">Make it easy to find specialty coffee worth reordering — by putting every independent UAE roaster's beans in one place, organized by roast and flavor instead of by brand, with one fast checkout.</w:t>
       </w:r>
     </w:p>
     <w:p>
@@ -209,7 +209,7 @@
           <w:sz w:val="24"/>
           <w:szCs w:val="24"/>
         </w:rPr>
-        <w:t xml:space="preserve">2.2 Legal structure &amp; basics</w:t>
+        <w:t xml:space="preserve">2.2 Legal &amp; regulatory basics (UAE)</w:t>
       </w:r>
     </w:p>
     <w:p>
@@ -231,7 +231,7 @@
           <w:sz w:val="21"/>
           <w:szCs w:val="21"/>
         </w:rPr>
-        <w:t xml:space="preserve">single-member LLC (or local equivalent) to separate personal and business liability once you take your first sale; sole proprietorship is acceptable for the first 0–90 days of testing.</w:t>
+        <w:t xml:space="preserve">a mainland LLC or free-zone e-commerce license (e.g. IFZA, DED e-trader for a very early solo stage) — a free-zone e-commerce license is usually the fastest and cheapest way to start legally.</w:t>
       </w:r>
     </w:p>
     <w:p>
@@ -249,7 +249,7 @@
           <w:sz w:val="21"/>
           <w:szCs w:val="21"/>
         </w:rPr>
-        <w:t xml:space="preserve">Register a business name and get an EIN/tax ID equivalent.</w:t>
+        <w:t xml:space="preserve">Register for VAT once turnover crosses the mandatory threshold (currently AED 375,000/year) — voluntary registration is possible earlier and lets the business reclaim input VAT on stock purchases.</w:t>
       </w:r>
     </w:p>
     <w:p>
@@ -267,7 +267,7 @@
           <w:sz w:val="21"/>
           <w:szCs w:val="21"/>
         </w:rPr>
-        <w:t xml:space="preserve">Check cottage-food and food-handling rules for your region — roasted coffee is generally lightly regulated, but confirm local requirements for reselling food/beverage products, especially if you roast in-house.</w:t>
+        <w:t xml:space="preserve">Food import/resale of packaged coffee generally falls under municipality food-trade rules (e.g. Dubai Municipality food code) — confirm labeling (roast date, allergen, weight) and storage requirements before listing products.</w:t>
       </w:r>
     </w:p>
     <w:p>
@@ -285,7 +285,7 @@
           <w:sz w:val="21"/>
           <w:szCs w:val="21"/>
         </w:rPr>
-        <w:t xml:space="preserve">Get product liability insurance once monthly revenue is meaningful (roughly Moderate tier onward).</w:t>
+        <w:t xml:space="preserve">Draft simple consignment or wholesale-purchase agreements with each roaster up front: who owns the stock until it sells, who eats spoilage/returns, and payment terms (net-30 is standard).</w:t>
       </w:r>
     </w:p>
     <w:p>
@@ -320,7 +320,7 @@
           <w:sz w:val="24"/>
           <w:szCs w:val="24"/>
         </w:rPr>
-        <w:t xml:space="preserve">3.1 Coffee beans</w:t>
+        <w:t xml:space="preserve">3.1 The core catalog — beans, not equipment</w:t>
       </w:r>
     </w:p>
     <w:p>
@@ -338,7 +338,7 @@
           <w:sz w:val="21"/>
           <w:szCs w:val="21"/>
         </w:rPr>
-        <w:t xml:space="preserve">Single-origin bags (e.g., Ethiopia, Colombia, Guatemala) — the storytelling anchor of the brand.</w:t>
+        <w:t xml:space="preserve">6–15 SKUs at launch: one flagship bag per partner roaster, spanning light to dark roast, so the catalog reads as a spectrum rather than a wall of near-duplicate options.</w:t>
       </w:r>
     </w:p>
     <w:p>
@@ -356,7 +356,7 @@
           <w:sz w:val="21"/>
           <w:szCs w:val="21"/>
         </w:rPr>
-        <w:t xml:space="preserve">2–3 house blends (an everyday drip blend, an espresso blend) for repeat, low-friction purchases.</w:t>
+        <w:t xml:space="preserve">Every listing carries: roaster name, origin, roast level, process (washed/natural/honey), tasting notes, and a plain-language brew recommendation.</w:t>
       </w:r>
     </w:p>
     <w:p>
@@ -374,7 +374,81 @@
           <w:sz w:val="21"/>
           <w:szCs w:val="21"/>
         </w:rPr>
-        <w:t xml:space="preserve">Whole bean by default; grind-on-demand or pre-ground as an order option.</w:t>
+        <w:t xml:space="preserve">250g bags as the standard format (matches regional buying habits and keeps per-order shipping weight low); larger 1kg formats offered for repeat buyers once demand is proven.</w:t>
+      </w:r>
+    </w:p>
+    <w:p>
+      <w:pPr>
+        <w:pStyle w:val="Heading2"/>
+        <w:spacing w:after="120" w:before="280"/>
+      </w:pPr>
+      <w:r>
+        <w:rPr>
+          <w:b/>
+          <w:bCs/>
+          <w:color w:val="1F3B33"/>
+          <w:sz w:val="24"/>
+          <w:szCs w:val="24"/>
+        </w:rPr>
+        <w:t xml:space="preserve">3.2 The roast line — the comparison tool, not a gimmick</w:t>
+      </w:r>
+    </w:p>
+    <w:p>
+      <w:pPr>
+        <w:spacing w:after="160" w:line="300"/>
+      </w:pPr>
+      <w:r>
+        <w:rPr>
+          <w:color w:val="222222"/>
+          <w:sz w:val="21"/>
+          <w:szCs w:val="21"/>
+        </w:rPr>
+        <w:t xml:space="preserve">Every bean is plotted on one light-to-dark roast scale regardless of which roaster made it. This is the site's actual value proposition: a customer who liked a light-roast Ethiopian from one roaster can find the next-closest option from a different roaster without having to taste-test blind. This becomes the main on-site discovery mechanism instead of a generic category filter.</w:t>
+      </w:r>
+    </w:p>
+    <w:p>
+      <w:pPr>
+        <w:pStyle w:val="Heading2"/>
+        <w:spacing w:after="120" w:before="280"/>
+      </w:pPr>
+      <w:r>
+        <w:rPr>
+          <w:b/>
+          <w:bCs/>
+          <w:color w:val="1F3B33"/>
+          <w:sz w:val="24"/>
+          <w:szCs w:val="24"/>
+        </w:rPr>
+        <w:t xml:space="preserve">3.3 Discovery bundles</w:t>
+      </w:r>
+    </w:p>
+    <w:p>
+      <w:pPr>
+        <w:spacing w:after="160" w:line="300"/>
+      </w:pPr>
+      <w:r>
+        <w:rPr>
+          <w:color w:val="222222"/>
+          <w:sz w:val="21"/>
+          <w:szCs w:val="21"/>
+        </w:rPr>
+        <w:t xml:space="preserve">A 3-bag “Discovery Sampler” (one light, one medium, one dark, from three different roasters, ~100g each) is the primary new-customer offer — low commitment, immediately demonstrates the comparison value, and converts into full-size repeat orders.</w:t>
+      </w:r>
+    </w:p>
+    <w:p>
+      <w:pPr>
+        <w:pStyle w:val="Heading2"/>
+        <w:spacing w:after="120" w:before="280"/>
+      </w:pPr>
+      <w:r>
+        <w:rPr>
+          <w:b/>
+          <w:bCs/>
+          <w:color w:val="1F3B33"/>
+          <w:sz w:val="24"/>
+          <w:szCs w:val="24"/>
+        </w:rPr>
+        <w:t xml:space="preserve">3.4 Deliberately out of scope at launch</w:t>
       </w:r>
     </w:p>
     <w:p>
@@ -392,23 +466,7 @@
           <w:sz w:val="21"/>
           <w:szCs w:val="21"/>
         </w:rPr>
-        <w:t xml:space="preserve">Roast levels clearly labeled (light / medium / dark) with tasting notes and a suggested brew method per bag.</w:t>
-      </w:r>
-    </w:p>
-    <w:p>
-      <w:pPr>
-        <w:pStyle w:val="Heading2"/>
-        <w:spacing w:after="120" w:before="280"/>
-      </w:pPr>
-      <w:r>
-        <w:rPr>
-          <w:b/>
-          <w:bCs/>
-          <w:color w:val="1F3B33"/>
-          <w:sz w:val="24"/>
-          <w:szCs w:val="24"/>
-        </w:rPr>
-        <w:t xml:space="preserve">3.2 Coffee essentials</w:t>
+        <w:t xml:space="preserve">No house-roasted blend — avoids roasting equipment, food-safety-for-manufacturing complexity, and recipe risk in year one.</w:t>
       </w:r>
     </w:p>
     <w:p>
@@ -426,7 +484,7 @@
           <w:sz w:val="21"/>
           <w:szCs w:val="21"/>
         </w:rPr>
-        <w:t xml:space="preserve">Entry-level manual brewers: pour-over dripper, French press, AeroPress.</w:t>
+        <w:t xml:space="preserve">No brewing equipment/essentials line — keeps inventory and supplier relationships simple; can be revisited later as an affiliate/drop-ship add-on, not a stocked category.</w:t>
       </w:r>
     </w:p>
     <w:p>
@@ -444,7 +502,71 @@
           <w:sz w:val="21"/>
           <w:szCs w:val="21"/>
         </w:rPr>
-        <w:t xml:space="preserve">Hand grinder and one entry electric grinder (grind consistency is the #1 lever on home coffee quality).</w:t>
+        <w:t xml:space="preserve">No subscription mechanic at launch, by design — the storefront is one-off purchase only; subscriptions can be layered on later once repeat-purchase behavior is visible in the data.</w:t>
+      </w:r>
+    </w:p>
+    <w:p>
+      <w:pPr>
+        <w:pStyle w:val="Heading1"/>
+        <w:pBdr>
+          <w:bottom w:val="single" w:color="B08944" w:sz="6" w:space="4"/>
+        </w:pBdr>
+        <w:spacing w:after="200" w:before="400"/>
+      </w:pPr>
+      <w:r>
+        <w:rPr>
+          <w:b/>
+          <w:bCs/>
+          <w:color w:val="1F3B33"/>
+          <w:sz w:val="30"/>
+          <w:szCs w:val="30"/>
+        </w:rPr>
+        <w:t xml:space="preserve">4. Market Analysis</w:t>
+      </w:r>
+    </w:p>
+    <w:p>
+      <w:pPr>
+        <w:pStyle w:val="Heading2"/>
+        <w:spacing w:after="120" w:before="280"/>
+      </w:pPr>
+      <w:r>
+        <w:rPr>
+          <w:b/>
+          <w:bCs/>
+          <w:color w:val="1F3B33"/>
+          <w:sz w:val="24"/>
+          <w:szCs w:val="24"/>
+        </w:rPr>
+        <w:t xml:space="preserve">4.1 Industry context — UAE</w:t>
+      </w:r>
+    </w:p>
+    <w:p>
+      <w:pPr>
+        <w:spacing w:after="160" w:line="300"/>
+      </w:pPr>
+      <w:r>
+        <w:rPr>
+          <w:color w:val="222222"/>
+          <w:sz w:val="21"/>
+          <w:szCs w:val="21"/>
+        </w:rPr>
+        <w:t xml:space="preserve">The UAE has a dense, fast-growing specialty coffee scene concentrated in Dubai and Abu Dhabi, with dozens of independent roasters that mostly sell direct through their own small sites or cafe counters. That fragmentation is the opening: no dominant single destination exists yet for comparing beans across roasters the way multi-brand marketplaces do in more mature markets.</w:t>
+      </w:r>
+    </w:p>
+    <w:p>
+      <w:pPr>
+        <w:pStyle w:val="Heading2"/>
+        <w:spacing w:after="120" w:before="280"/>
+      </w:pPr>
+      <w:r>
+        <w:rPr>
+          <w:b/>
+          <w:bCs/>
+          <w:color w:val="1F3B33"/>
+          <w:sz w:val="24"/>
+          <w:szCs w:val="24"/>
+        </w:rPr>
+        <w:t xml:space="preserve">4.2 Target customer</w:t>
       </w:r>
     </w:p>
     <w:p>
@@ -462,7 +584,7 @@
           <w:sz w:val="21"/>
           <w:szCs w:val="21"/>
         </w:rPr>
-        <w:t xml:space="preserve">Filters, a basic gram scale, and a storage canister — sold individually and as a “starter kit” bundle with beans.</w:t>
+        <w:t xml:space="preserve">Primary: residents (largely expatriate, 25–45) already buying specialty beans online who are currently juggling multiple roasters' individual sites and shipping fees.</w:t>
       </w:r>
     </w:p>
     <w:p>
@@ -480,100 +602,7 @@
           <w:sz w:val="21"/>
           <w:szCs w:val="21"/>
         </w:rPr>
-        <w:t xml:space="preserve">Curate, don't manufacture: source essentials from existing wholesale suppliers/manufacturers rather than developing hardware.</w:t>
-      </w:r>
-    </w:p>
-    <w:p>
-      <w:pPr>
-        <w:pStyle w:val="Heading2"/>
-        <w:spacing w:after="120" w:before="280"/>
-      </w:pPr>
-      <w:r>
-        <w:rPr>
-          <w:b/>
-          <w:bCs/>
-          <w:color w:val="1F3B33"/>
-          <w:sz w:val="24"/>
-          <w:szCs w:val="24"/>
-        </w:rPr>
-        <w:t xml:space="preserve">3.3 Subscriptions</w:t>
-      </w:r>
-    </w:p>
-    <w:p>
-      <w:pPr>
-        <w:spacing w:after="160" w:line="300"/>
-      </w:pPr>
-      <w:r>
-        <w:rPr>
-          <w:color w:val="222222"/>
-          <w:sz w:val="21"/>
-          <w:szCs w:val="21"/>
-        </w:rPr>
-        <w:t xml:space="preserve">A recurring “beans on a schedule” subscription (every 2 or 4 weeks) is the highest-leverage feature in this plan: it turns a one-time buyer into predictable monthly revenue and is standard in this category (offer it from day one, even manually via the storefront's native subscription app).</w:t>
-      </w:r>
-    </w:p>
-    <w:p>
-      <w:pPr>
-        <w:pStyle w:val="Heading1"/>
-        <w:pBdr>
-          <w:bottom w:val="single" w:color="B08944" w:sz="6" w:space="4"/>
-        </w:pBdr>
-        <w:spacing w:after="200" w:before="400"/>
-      </w:pPr>
-      <w:r>
-        <w:rPr>
-          <w:b/>
-          <w:bCs/>
-          <w:color w:val="1F3B33"/>
-          <w:sz w:val="30"/>
-          <w:szCs w:val="30"/>
-        </w:rPr>
-        <w:t xml:space="preserve">4. Market Analysis</w:t>
-      </w:r>
-    </w:p>
-    <w:p>
-      <w:pPr>
-        <w:pStyle w:val="Heading2"/>
-        <w:spacing w:after="120" w:before="280"/>
-      </w:pPr>
-      <w:r>
-        <w:rPr>
-          <w:b/>
-          <w:bCs/>
-          <w:color w:val="1F3B33"/>
-          <w:sz w:val="24"/>
-          <w:szCs w:val="24"/>
-        </w:rPr>
-        <w:t xml:space="preserve">4.1 Industry context</w:t>
-      </w:r>
-    </w:p>
-    <w:p>
-      <w:pPr>
-        <w:spacing w:after="160" w:line="300"/>
-      </w:pPr>
-      <w:r>
-        <w:rPr>
-          <w:color w:val="222222"/>
-          <w:sz w:val="21"/>
-          <w:szCs w:val="21"/>
-        </w:rPr>
-        <w:t xml:space="preserve">Specialty coffee is a large, still-growing category with strong repeat-purchase behavior. Online specialty roasters compete less on price than on story (origin, roaster, sustainability), curation (a small, well-explained selection beats an overwhelming catalog), and experience (packaging, brew guides, customer service).</w:t>
-      </w:r>
-    </w:p>
-    <w:p>
-      <w:pPr>
-        <w:pStyle w:val="Heading2"/>
-        <w:spacing w:after="120" w:before="280"/>
-      </w:pPr>
-      <w:r>
-        <w:rPr>
-          <w:b/>
-          <w:bCs/>
-          <w:color w:val="1F3B33"/>
-          <w:sz w:val="24"/>
-          <w:szCs w:val="24"/>
-        </w:rPr>
-        <w:t xml:space="preserve">4.2 Target customer</w:t>
+        <w:t xml:space="preserve">Secondary: newcomers to specialty coffee who want a low-risk way to explore local roasters without committing to a full bag from each — the Discovery Sampler is built for this segment.</w:t>
       </w:r>
     </w:p>
     <w:p>
@@ -591,7 +620,100 @@
           <w:sz w:val="21"/>
           <w:szCs w:val="21"/>
         </w:rPr>
-        <w:t xml:space="preserve">Primary: home coffee enthusiasts, ages 25–45, who already own or want a manual brewer and value quality over convenience pods.</w:t>
+        <w:t xml:space="preserve">Tertiary (later): small offices, hotels and cafes wanting a single vendor and invoice for beans sourced from several roasters — a natural B2B extension once the consumer catalog and logistics are proven.</w:t>
+      </w:r>
+    </w:p>
+    <w:p>
+      <w:pPr>
+        <w:pStyle w:val="Heading2"/>
+        <w:spacing w:after="120" w:before="280"/>
+      </w:pPr>
+      <w:r>
+        <w:rPr>
+          <w:b/>
+          <w:bCs/>
+          <w:color w:val="1F3B33"/>
+          <w:sz w:val="24"/>
+          <w:szCs w:val="24"/>
+        </w:rPr>
+        <w:t xml:space="preserve">4.3 Competitive landscape</w:t>
+      </w:r>
+    </w:p>
+    <w:p>
+      <w:pPr>
+        <w:spacing w:after="160" w:line="300"/>
+      </w:pPr>
+      <w:r>
+        <w:rPr>
+          <w:color w:val="222222"/>
+          <w:sz w:val="21"/>
+          <w:szCs w:val="21"/>
+        </w:rPr>
+        <w:t xml:space="preserve">Direct competitors are other UAE multi-roaster marketplaces (e.g. Spresso) plus each individual roaster's own online store. Differentiation has to come from curation quality (the roast-line comparison), delivery speed/reliability, and a genuinely bilingual experience — not from being the only aggregator, since it likely won't be. Being explicitly easier to use in Arabic, with AED pricing and local delivery expectations set correctly, is a real, achievable edge against roasters whose own sites are English-only.</w:t>
+      </w:r>
+    </w:p>
+    <w:p>
+      <w:pPr>
+        <w:pStyle w:val="Heading1"/>
+        <w:pBdr>
+          <w:bottom w:val="single" w:color="B08944" w:sz="6" w:space="4"/>
+        </w:pBdr>
+        <w:spacing w:after="200" w:before="400"/>
+      </w:pPr>
+      <w:r>
+        <w:rPr>
+          <w:b/>
+          <w:bCs/>
+          <w:color w:val="1F3B33"/>
+          <w:sz w:val="30"/>
+          <w:szCs w:val="30"/>
+        </w:rPr>
+        <w:t xml:space="preserve">5. Marketing &amp; Sales Strategy</w:t>
+      </w:r>
+    </w:p>
+    <w:p>
+      <w:pPr>
+        <w:pStyle w:val="Heading2"/>
+        <w:spacing w:after="120" w:before="280"/>
+      </w:pPr>
+      <w:r>
+        <w:rPr>
+          <w:b/>
+          <w:bCs/>
+          <w:color w:val="1F3B33"/>
+          <w:sz w:val="24"/>
+          <w:szCs w:val="24"/>
+        </w:rPr>
+        <w:t xml:space="preserve">5.1 Platform</w:t>
+      </w:r>
+    </w:p>
+    <w:p>
+      <w:pPr>
+        <w:spacing w:after="160" w:line="300"/>
+      </w:pPr>
+      <w:r>
+        <w:rPr>
+          <w:color w:val="222222"/>
+          <w:sz w:val="21"/>
+          <w:szCs w:val="21"/>
+        </w:rPr>
+        <w:t xml:space="preserve">A bilingual (English/Arabic, full RTL) storefront is non-negotiable for this market — treat it as a launch requirement, not a later localization pass. Shopify (with a RTL-capable theme or Shopify Markets) or a custom build are both viable; the deciding factor is how much catalog-curation logic (the roast-line placement) needs to be custom versus themeable.</w:t>
+      </w:r>
+    </w:p>
+    <w:p>
+      <w:pPr>
+        <w:pStyle w:val="Heading2"/>
+        <w:spacing w:after="120" w:before="280"/>
+      </w:pPr>
+      <w:r>
+        <w:rPr>
+          <w:b/>
+          <w:bCs/>
+          <w:color w:val="1F3B33"/>
+          <w:sz w:val="24"/>
+          <w:szCs w:val="24"/>
+        </w:rPr>
+        <w:t xml:space="preserve">5.2 Customer acquisition</w:t>
       </w:r>
     </w:p>
     <w:p>
@@ -609,7 +731,7 @@
           <w:sz w:val="21"/>
           <w:szCs w:val="21"/>
         </w:rPr>
-        <w:t xml:space="preserve">Secondary: gift buyers (holiday/birthday bundles) and small offices wanting a better everyday coffee than a commodity bag.</w:t>
+        <w:t xml:space="preserve">Roaster co-marketing: each partner roaster promotes the marketplace to their own existing audience in exchange for shelf space — effectively free distribution that a single-brand roastery doesn't have access to.</w:t>
       </w:r>
     </w:p>
     <w:p>
@@ -627,100 +749,7 @@
           <w:sz w:val="21"/>
           <w:szCs w:val="21"/>
         </w:rPr>
-        <w:t xml:space="preserve">Tertiary (later): small cafes or offices wanting wholesale bags — a natural expansion once the roast/supply chain is proven.</w:t>
-      </w:r>
-    </w:p>
-    <w:p>
-      <w:pPr>
-        <w:pStyle w:val="Heading2"/>
-        <w:spacing w:after="120" w:before="280"/>
-      </w:pPr>
-      <w:r>
-        <w:rPr>
-          <w:b/>
-          <w:bCs/>
-          <w:color w:val="1F3B33"/>
-          <w:sz w:val="24"/>
-          <w:szCs w:val="24"/>
-        </w:rPr>
-        <w:t xml:space="preserve">4.3 Competitive landscape</w:t>
-      </w:r>
-    </w:p>
-    <w:p>
-      <w:pPr>
-        <w:spacing w:after="160" w:line="300"/>
-      </w:pPr>
-      <w:r>
-        <w:rPr>
-          <w:color w:val="222222"/>
-          <w:sz w:val="21"/>
-          <w:szCs w:val="21"/>
-        </w:rPr>
-        <w:t xml:space="preserve">Competition ranges from national specialty roasters with strong brands, to thousands of small independent online roasters, to marketplaces (Amazon) selling essentials at low margin. Differentiation comes from a tight, well-curated catalog (beans + the exact tools to brew them), clear educational content, and a distinct visual/brand identity — not from being the cheapest option.</w:t>
-      </w:r>
-    </w:p>
-    <w:p>
-      <w:pPr>
-        <w:pStyle w:val="Heading1"/>
-        <w:pBdr>
-          <w:bottom w:val="single" w:color="B08944" w:sz="6" w:space="4"/>
-        </w:pBdr>
-        <w:spacing w:after="200" w:before="400"/>
-      </w:pPr>
-      <w:r>
-        <w:rPr>
-          <w:b/>
-          <w:bCs/>
-          <w:color w:val="1F3B33"/>
-          <w:sz w:val="30"/>
-          <w:szCs w:val="30"/>
-        </w:rPr>
-        <w:t xml:space="preserve">5. Marketing &amp; Sales Strategy — Online Store</w:t>
-      </w:r>
-    </w:p>
-    <w:p>
-      <w:pPr>
-        <w:pStyle w:val="Heading2"/>
-        <w:spacing w:after="120" w:before="280"/>
-      </w:pPr>
-      <w:r>
-        <w:rPr>
-          <w:b/>
-          <w:bCs/>
-          <w:color w:val="1F3B33"/>
-          <w:sz w:val="24"/>
-          <w:szCs w:val="24"/>
-        </w:rPr>
-        <w:t xml:space="preserve">5.1 Platform</w:t>
-      </w:r>
-    </w:p>
-    <w:p>
-      <w:pPr>
-        <w:spacing w:after="160" w:line="300"/>
-      </w:pPr>
-      <w:r>
-        <w:rPr>
-          <w:color w:val="222222"/>
-          <w:sz w:val="21"/>
-          <w:szCs w:val="21"/>
-        </w:rPr>
-        <w:t xml:space="preserve">Build the storefront on Shopify (fastest to launch, has built-in subscription apps, low technical overhead) or WooCommerce/WordPress if lower platform fees matter more than setup speed. Either supports the product catalog, subscriptions, and content pages described below.</w:t>
-      </w:r>
-    </w:p>
-    <w:p>
-      <w:pPr>
-        <w:pStyle w:val="Heading2"/>
-        <w:spacing w:after="120" w:before="280"/>
-      </w:pPr>
-      <w:r>
-        <w:rPr>
-          <w:b/>
-          <w:bCs/>
-          <w:color w:val="1F3B33"/>
-          <w:sz w:val="24"/>
-          <w:szCs w:val="24"/>
-        </w:rPr>
-        <w:t xml:space="preserve">5.2 Customer acquisition</w:t>
+        <w:t xml:space="preserve">Instagram/TikTok in both languages: short comparison-style content (“three Dubai roasters' light roasts, side by side”) plays directly to the roast-line concept.</w:t>
       </w:r>
     </w:p>
     <w:p>
@@ -738,7 +767,7 @@
           <w:sz w:val="21"/>
           <w:szCs w:val="21"/>
         </w:rPr>
-        <w:t xml:space="preserve">Content &amp; SEO: brewing guides, origin/roaster stories, “how to dial in your grinder” posts — compounding, low-cost traffic over time.</w:t>
+        <w:t xml:space="preserve">Arabic-language SEO and content are comparatively underserved in this category regionally — a real opportunity, not just a checkbox.</w:t>
       </w:r>
     </w:p>
     <w:p>
@@ -756,7 +785,71 @@
           <w:sz w:val="21"/>
           <w:szCs w:val="21"/>
         </w:rPr>
-        <w:t xml:space="preserve">Instagram/TikTok: short brew-process and unboxing videos; coffee is a highly visual, tactile product.</w:t>
+        <w:t xml:space="preserve">Discovery Sampler as the paid-ad landing offer: low price point, clear value, natural upsell path into full-size repeat orders.</w:t>
+      </w:r>
+    </w:p>
+    <w:p>
+      <w:pPr>
+        <w:pStyle w:val="Heading2"/>
+        <w:spacing w:after="120" w:before="280"/>
+      </w:pPr>
+      <w:r>
+        <w:rPr>
+          <w:b/>
+          <w:bCs/>
+          <w:color w:val="1F3B33"/>
+          <w:sz w:val="24"/>
+          <w:szCs w:val="24"/>
+        </w:rPr>
+        <w:t xml:space="preserve">5.3 Retention</w:t>
+      </w:r>
+    </w:p>
+    <w:p>
+      <w:pPr>
+        <w:spacing w:after="160" w:line="300"/>
+      </w:pPr>
+      <w:r>
+        <w:rPr>
+          <w:color w:val="222222"/>
+          <w:sz w:val="21"/>
+          <w:szCs w:val="21"/>
+        </w:rPr>
+        <w:t xml:space="preserve">Without a subscription mechanic at launch, retention relies on email/WhatsApp re-engagement (“your Ethiopia Guji is probably running low” timed around typical 250g consumption), a simple loyalty credit, and expanding the roaster roster so there's always something new to compare.</w:t>
+      </w:r>
+    </w:p>
+    <w:p>
+      <w:pPr>
+        <w:pStyle w:val="Heading1"/>
+        <w:pBdr>
+          <w:bottom w:val="single" w:color="B08944" w:sz="6" w:space="4"/>
+        </w:pBdr>
+        <w:spacing w:after="200" w:before="400"/>
+      </w:pPr>
+      <w:r>
+        <w:rPr>
+          <w:b/>
+          <w:bCs/>
+          <w:color w:val="1F3B33"/>
+          <w:sz w:val="30"/>
+          <w:szCs w:val="30"/>
+        </w:rPr>
+        <w:t xml:space="preserve">6. Operations Plan</w:t>
+      </w:r>
+    </w:p>
+    <w:p>
+      <w:pPr>
+        <w:pStyle w:val="Heading2"/>
+        <w:spacing w:after="120" w:before="280"/>
+      </w:pPr>
+      <w:r>
+        <w:rPr>
+          <w:b/>
+          <w:bCs/>
+          <w:color w:val="1F3B33"/>
+          <w:sz w:val="24"/>
+          <w:szCs w:val="24"/>
+        </w:rPr>
+        <w:t xml:space="preserve">6.1 Sourcing &amp; inventory</w:t>
       </w:r>
     </w:p>
     <w:p>
@@ -774,7 +867,7 @@
           <w:sz w:val="21"/>
           <w:szCs w:val="21"/>
         </w:rPr>
-        <w:t xml:space="preserve">Email: capture emails pre-launch with a simple landing page; welcome sequence + restock/subscription reminders.</w:t>
+        <w:t xml:space="preserve">Start with 5–8 roaster partners on consignment (they supply stock, get paid as it sells) to minimize upfront cash tied up in inventory; move higher-velocity SKUs to outright wholesale purchase once sales data justifies it.</w:t>
       </w:r>
     </w:p>
     <w:p>
@@ -792,7 +885,7 @@
           <w:sz w:val="21"/>
           <w:szCs w:val="21"/>
         </w:rPr>
-        <w:t xml:space="preserve">Founding-customer offer: discounted starter kits for the first 50–100 customers in exchange for reviews and photos.</w:t>
+        <w:t xml:space="preserve">Agree a maximum shelf life per bag (e.g. 60 days from roast date) with every partner and pull anything older — freshness is the easiest trust signal to make or break as a marketplace, since the business doesn't control the roast itself.</w:t>
       </w:r>
     </w:p>
     <w:p>
@@ -810,7 +903,7 @@
           <w:sz w:val="21"/>
           <w:szCs w:val="21"/>
         </w:rPr>
-        <w:t xml:space="preserve">Local: farmers markets or pop-ups (if pursued) double as free customer research and content generation for the online store.</w:t>
+        <w:t xml:space="preserve">Single fulfillment point: all partner roasters deliver stock to one small warehouse/storage unit; the business picks, packs, and ships every customer order as one shipment regardless of how many roasters are represented in the cart.</w:t>
       </w:r>
     </w:p>
     <w:p>
@@ -826,55 +919,7 @@
           <w:sz w:val="24"/>
           <w:szCs w:val="24"/>
         </w:rPr>
-        <w:t xml:space="preserve">5.3 Retention</w:t>
-      </w:r>
-    </w:p>
-    <w:p>
-      <w:pPr>
-        <w:spacing w:after="160" w:line="300"/>
-      </w:pPr>
-      <w:r>
-        <w:rPr>
-          <w:color w:val="222222"/>
-          <w:sz w:val="21"/>
-          <w:szCs w:val="21"/>
-        </w:rPr>
-        <w:t xml:space="preserve">Subscriptions, a simple loyalty/referral credit, and packaging inserts (a QR code to a brew guide or reorder link) keep repeat-purchase rate — the main driver of long-term profitability in this category — as high as possible.</w:t>
-      </w:r>
-    </w:p>
-    <w:p>
-      <w:pPr>
-        <w:pStyle w:val="Heading1"/>
-        <w:pBdr>
-          <w:bottom w:val="single" w:color="B08944" w:sz="6" w:space="4"/>
-        </w:pBdr>
-        <w:spacing w:after="200" w:before="400"/>
-      </w:pPr>
-      <w:r>
-        <w:rPr>
-          <w:b/>
-          <w:bCs/>
-          <w:color w:val="1F3B33"/>
-          <w:sz w:val="30"/>
-          <w:szCs w:val="30"/>
-        </w:rPr>
-        <w:t xml:space="preserve">6. Operations Plan</w:t>
-      </w:r>
-    </w:p>
-    <w:p>
-      <w:pPr>
-        <w:pStyle w:val="Heading2"/>
-        <w:spacing w:after="120" w:before="280"/>
-      </w:pPr>
-      <w:r>
-        <w:rPr>
-          <w:b/>
-          <w:bCs/>
-          <w:color w:val="1F3B33"/>
-          <w:sz w:val="24"/>
-          <w:szCs w:val="24"/>
-        </w:rPr>
-        <w:t xml:space="preserve">6.1 Sourcing &amp; fulfillment</w:t>
+        <w:t xml:space="preserve">6.2 Delivery</w:t>
       </w:r>
     </w:p>
     <w:p>
@@ -892,7 +937,7 @@
           <w:sz w:val="21"/>
           <w:szCs w:val="21"/>
         </w:rPr>
-        <w:t xml:space="preserve">Start by buying pre-roasted beans from an established roaster under a white-label/private-label arrangement, or from a small local roaster willing to co-brand — this avoids roasting equipment costs entirely at the Lean tier.</w:t>
+        <w:t xml:space="preserve">Dubai: same-day or next-day via a local courier/aggregator (e.g. a same-day delivery API partner); rest of UAE: 1–2 days via a national courier (e.g. Aramex).</w:t>
       </w:r>
     </w:p>
     <w:p>
@@ -910,72 +955,7 @@
           <w:sz w:val="21"/>
           <w:szCs w:val="21"/>
         </w:rPr>
-        <w:t xml:space="preserve">Move to in-house roasting (a small sample or 1–2kg roaster) only once volume justifies the equipment and the time cost of learning to roast consistently — realistically Moderate/Growth tier.</w:t>
-      </w:r>
-    </w:p>
-    <w:p>
-      <w:pPr>
-        <w:pStyle w:val="ListParagraph"/>
-        <w:numPr>
-          <w:ilvl w:val="0"/>
-          <w:numId w:val="2"/>
-        </w:numPr>
-        <w:spacing w:after="80" w:line="280"/>
-      </w:pPr>
-      <w:r>
-        <w:rPr>
-          <w:color w:val="222222"/>
-          <w:sz w:val="21"/>
-          <w:szCs w:val="21"/>
-        </w:rPr>
-        <w:t xml:space="preserve">Essentials: source from existing wholesale distributors of pour-over gear, grinders, and filters; hold minimal stock and reorder based on sales velocity.</w:t>
-      </w:r>
-    </w:p>
-    <w:p>
-      <w:pPr>
-        <w:pStyle w:val="ListParagraph"/>
-        <w:numPr>
-          <w:ilvl w:val="0"/>
-          <w:numId w:val="2"/>
-        </w:numPr>
-        <w:spacing w:after="80" w:line="280"/>
-      </w:pPr>
-      <w:r>
-        <w:rPr>
-          <w:color w:val="222222"/>
-          <w:sz w:val="21"/>
-          <w:szCs w:val="21"/>
-        </w:rPr>
-        <w:t xml:space="preserve">Fulfillment: pack and ship orders yourself at Lean/Moderate tier (2–3 orders/day is very manageable); consider a 3PL only once daily order volume makes self-fulfillment a bottleneck.</w:t>
-      </w:r>
-    </w:p>
-    <w:p>
-      <w:pPr>
-        <w:pStyle w:val="Heading2"/>
-        <w:spacing w:after="120" w:before="280"/>
-      </w:pPr>
-      <w:r>
-        <w:rPr>
-          <w:b/>
-          <w:bCs/>
-          <w:color w:val="1F3B33"/>
-          <w:sz w:val="24"/>
-          <w:szCs w:val="24"/>
-        </w:rPr>
-        <w:t xml:space="preserve">6.2 Packaging</w:t>
-      </w:r>
-    </w:p>
-    <w:p>
-      <w:pPr>
-        <w:spacing w:after="160" w:line="300"/>
-      </w:pPr>
-      <w:r>
-        <w:rPr>
-          <w:color w:val="222222"/>
-          <w:sz w:val="21"/>
-          <w:szCs w:val="21"/>
-        </w:rPr>
-        <w:t xml:space="preserve">Use one-way degassing valve bags for beans (freshness is a core promise of specialty coffee), branded labels, and a printed brew-tip card in every order — this is inexpensive and directly supports the retention strategy above.</w:t>
+        <w:t xml:space="preserve">Build delivery cost into the retail price rather than charging separately below a minimum order threshold — reduces cart abandonment, which matters more for a comparison-shopping marketplace than for a single destination site.</w:t>
       </w:r>
     </w:p>
     <w:p>
@@ -1007,7 +987,7 @@
           <w:sz w:val="21"/>
           <w:szCs w:val="21"/>
         </w:rPr>
-        <w:t xml:space="preserve">Solo founder-operated at launch, covering sourcing, storefront, marketing, and fulfillment personally. Plan to bring in part-time help for packing/shipping once order volume exceeds roughly 15–20 orders/day, and a part-time social/content person once content marketing is validated as a working acquisition channel.</w:t>
+        <w:t xml:space="preserve">Solo founder-operated at launch, covering roaster partnerships, the storefront, marketing, and order packing personally. The first hire (part-time) should be for packing/fulfillment once daily order volume exceeds roughly 15–20 orders/day; the second should be Arabic-first content/community, since that's the least defensible-by-competitors advantage identified above.</w:t>
       </w:r>
     </w:p>
     <w:p>
@@ -1044,7 +1024,7 @@
           <w:sz w:val="21"/>
           <w:szCs w:val="21"/>
         </w:rPr>
-        <w:t xml:space="preserve">Three tiers below since the exact budget wasn't fixed — pick the row that matches available capital. Figures are illustrative planning estimates in USD; confirm against real supplier quotes before committing spend.</w:t>
+        <w:t xml:space="preserve">Three tiers below since the exact budget wasn't fixed — pick the row that matches available capital. Figures are illustrative planning estimates in AED; confirm against real supplier and courier quotes before committing spend.</w:t>
       </w:r>
     </w:p>
     <w:p>
@@ -1132,7 +1112,7 @@
                 <w:sz w:val="20"/>
                 <w:szCs w:val="20"/>
               </w:rPr>
-              <w:t xml:space="preserve">Lean (&lt;$5k)</w:t>
+              <w:t xml:space="preserve">Lean (&lt;AED 20k)</w:t>
             </w:r>
           </w:p>
         </w:tc>
@@ -1159,7 +1139,7 @@
                 <w:sz w:val="20"/>
                 <w:szCs w:val="20"/>
               </w:rPr>
-              <w:t xml:space="preserve">Moderate ($5–25k)</w:t>
+              <w:t xml:space="preserve">Moderate (AED 20–90k)</w:t>
             </w:r>
           </w:p>
         </w:tc>
@@ -1186,7 +1166,7 @@
                 <w:sz w:val="20"/>
                 <w:szCs w:val="20"/>
               </w:rPr>
-              <w:t xml:space="preserve">Growth ($25–100k)</w:t>
+              <w:t xml:space="preserve">Growth (AED 90–350k)</w:t>
             </w:r>
           </w:p>
         </w:tc>
@@ -1215,7 +1195,7 @@
                 <w:sz w:val="20"/>
                 <w:szCs w:val="20"/>
               </w:rPr>
-              <w:t xml:space="preserve">E-commerce platform &amp; domain (1 yr)</w:t>
+              <w:t xml:space="preserve">Trade license &amp; registration</w:t>
             </w:r>
           </w:p>
         </w:tc>
@@ -1242,7 +1222,7 @@
                 <w:sz w:val="20"/>
                 <w:szCs w:val="20"/>
               </w:rPr>
-              <w:t xml:space="preserve">$400</w:t>
+              <w:t xml:space="preserve">AED 3,500 (free zone)</w:t>
             </w:r>
           </w:p>
         </w:tc>
@@ -1269,7 +1249,7 @@
                 <w:sz w:val="20"/>
                 <w:szCs w:val="20"/>
               </w:rPr>
-              <w:t xml:space="preserve">$500</w:t>
+              <w:t xml:space="preserve">AED 8,000</w:t>
             </w:r>
           </w:p>
         </w:tc>
@@ -1296,7 +1276,7 @@
                 <w:sz w:val="20"/>
                 <w:szCs w:val="20"/>
               </w:rPr>
-              <w:t xml:space="preserve">$600</w:t>
+              <w:t xml:space="preserve">AED 15,000</w:t>
             </w:r>
           </w:p>
         </w:tc>
@@ -1325,7 +1305,7 @@
                 <w:sz w:val="20"/>
                 <w:szCs w:val="20"/>
               </w:rPr>
-              <w:t xml:space="preserve">Branding &amp; packaging design</w:t>
+              <w:t xml:space="preserve">E-commerce platform, domain, bilingual theme</w:t>
             </w:r>
           </w:p>
         </w:tc>
@@ -1352,7 +1332,7 @@
                 <w:sz w:val="20"/>
                 <w:szCs w:val="20"/>
               </w:rPr>
-              <w:t xml:space="preserve">$200 (DIY/templates)</w:t>
+              <w:t xml:space="preserve">AED 1,500</w:t>
             </w:r>
           </w:p>
         </w:tc>
@@ -1379,7 +1359,7 @@
                 <w:sz w:val="20"/>
                 <w:szCs w:val="20"/>
               </w:rPr>
-              <w:t xml:space="preserve">$1,500</w:t>
+              <w:t xml:space="preserve">AED 6,000</w:t>
             </w:r>
           </w:p>
         </w:tc>
@@ -1406,7 +1386,7 @@
                 <w:sz w:val="20"/>
                 <w:szCs w:val="20"/>
               </w:rPr>
-              <w:t xml:space="preserve">$4,000</w:t>
+              <w:t xml:space="preserve">AED 15,000</w:t>
             </w:r>
           </w:p>
         </w:tc>
@@ -1435,7 +1415,7 @@
                 <w:sz w:val="20"/>
                 <w:szCs w:val="20"/>
               </w:rPr>
-              <w:t xml:space="preserve">Initial bean inventory (pre-roasted, private label)</w:t>
+              <w:t xml:space="preserve">Branding &amp; bilingual content/design</w:t>
             </w:r>
           </w:p>
         </w:tc>
@@ -1462,7 +1442,7 @@
                 <w:sz w:val="20"/>
                 <w:szCs w:val="20"/>
               </w:rPr>
-              <w:t xml:space="preserve">$800</w:t>
+              <w:t xml:space="preserve">AED 800 (DIY/templates)</w:t>
             </w:r>
           </w:p>
         </w:tc>
@@ -1489,7 +1469,7 @@
                 <w:sz w:val="20"/>
                 <w:szCs w:val="20"/>
               </w:rPr>
-              <w:t xml:space="preserve">$3,000</w:t>
+              <w:t xml:space="preserve">AED 6,000</w:t>
             </w:r>
           </w:p>
         </w:tc>
@@ -1516,7 +1496,7 @@
                 <w:sz w:val="20"/>
                 <w:szCs w:val="20"/>
               </w:rPr>
-              <w:t xml:space="preserve">$8,000</w:t>
+              <w:t xml:space="preserve">AED 15,000</w:t>
             </w:r>
           </w:p>
         </w:tc>
@@ -1545,7 +1525,7 @@
                 <w:sz w:val="20"/>
                 <w:szCs w:val="20"/>
               </w:rPr>
-              <w:t xml:space="preserve">Essentials starter inventory (grinders, brewers, filters)</w:t>
+              <w:t xml:space="preserve">Initial consigned/purchased inventory (6–15 SKUs)</w:t>
             </w:r>
           </w:p>
         </w:tc>
@@ -1572,7 +1552,7 @@
                 <w:sz w:val="20"/>
                 <w:szCs w:val="20"/>
               </w:rPr>
-              <w:t xml:space="preserve">$600</w:t>
+              <w:t xml:space="preserve">AED 3,000 (mostly consignment)</w:t>
             </w:r>
           </w:p>
         </w:tc>
@@ -1599,7 +1579,7 @@
                 <w:sz w:val="20"/>
                 <w:szCs w:val="20"/>
               </w:rPr>
-              <w:t xml:space="preserve">$3,500</w:t>
+              <w:t xml:space="preserve">AED 15,000</w:t>
             </w:r>
           </w:p>
         </w:tc>
@@ -1626,7 +1606,7 @@
                 <w:sz w:val="20"/>
                 <w:szCs w:val="20"/>
               </w:rPr>
-              <w:t xml:space="preserve">$10,000</w:t>
+              <w:t xml:space="preserve">AED 40,000</w:t>
             </w:r>
           </w:p>
         </w:tc>
@@ -1655,7 +1635,7 @@
                 <w:sz w:val="20"/>
                 <w:szCs w:val="20"/>
               </w:rPr>
-              <w:t xml:space="preserve">Packaging (bags, labels, boxes, inserts)</w:t>
+              <w:t xml:space="preserve">Packaging (outer boxes, inserts, tape, labels)</w:t>
             </w:r>
           </w:p>
         </w:tc>
@@ -1682,7 +1662,7 @@
                 <w:sz w:val="20"/>
                 <w:szCs w:val="20"/>
               </w:rPr>
-              <w:t xml:space="preserve">$300</w:t>
+              <w:t xml:space="preserve">AED 1,200</w:t>
             </w:r>
           </w:p>
         </w:tc>
@@ -1709,7 +1689,7 @@
                 <w:sz w:val="20"/>
                 <w:szCs w:val="20"/>
               </w:rPr>
-              <w:t xml:space="preserve">$1,200</w:t>
+              <w:t xml:space="preserve">AED 4,000</w:t>
             </w:r>
           </w:p>
         </w:tc>
@@ -1736,7 +1716,7 @@
                 <w:sz w:val="20"/>
                 <w:szCs w:val="20"/>
               </w:rPr>
-              <w:t xml:space="preserve">$3,000</w:t>
+              <w:t xml:space="preserve">AED 10,000</w:t>
             </w:r>
           </w:p>
         </w:tc>
@@ -1765,7 +1745,7 @@
                 <w:sz w:val="20"/>
                 <w:szCs w:val="20"/>
               </w:rPr>
-              <w:t xml:space="preserve">Photography &amp; content</w:t>
+              <w:t xml:space="preserve">Photography &amp; bilingual content</w:t>
             </w:r>
           </w:p>
         </w:tc>
@@ -1792,7 +1772,7 @@
                 <w:sz w:val="20"/>
                 <w:szCs w:val="20"/>
               </w:rPr>
-              <w:t xml:space="preserve">$0 (self-shot)</w:t>
+              <w:t xml:space="preserve">AED 0 (self-shot)</w:t>
             </w:r>
           </w:p>
         </w:tc>
@@ -1819,7 +1799,7 @@
                 <w:sz w:val="20"/>
                 <w:szCs w:val="20"/>
               </w:rPr>
-              <w:t xml:space="preserve">$1,000</w:t>
+              <w:t xml:space="preserve">AED 4,000</w:t>
             </w:r>
           </w:p>
         </w:tc>
@@ -1846,7 +1826,7 @@
                 <w:sz w:val="20"/>
                 <w:szCs w:val="20"/>
               </w:rPr>
-              <w:t xml:space="preserve">$3,000</w:t>
+              <w:t xml:space="preserve">AED 12,000</w:t>
             </w:r>
           </w:p>
         </w:tc>
@@ -1902,7 +1882,7 @@
                 <w:sz w:val="20"/>
                 <w:szCs w:val="20"/>
               </w:rPr>
-              <w:t xml:space="preserve">$300</w:t>
+              <w:t xml:space="preserve">AED 1,500</w:t>
             </w:r>
           </w:p>
         </w:tc>
@@ -1929,7 +1909,7 @@
                 <w:sz w:val="20"/>
                 <w:szCs w:val="20"/>
               </w:rPr>
-              <w:t xml:space="preserve">$4,000</w:t>
+              <w:t xml:space="preserve">AED 15,000</w:t>
             </w:r>
           </w:p>
         </w:tc>
@@ -1956,7 +1936,7 @@
                 <w:sz w:val="20"/>
                 <w:szCs w:val="20"/>
               </w:rPr>
-              <w:t xml:space="preserve">$15,000</w:t>
+              <w:t xml:space="preserve">AED 60,000</w:t>
             </w:r>
           </w:p>
         </w:tc>
@@ -1985,7 +1965,7 @@
                 <w:sz w:val="20"/>
                 <w:szCs w:val="20"/>
               </w:rPr>
-              <w:t xml:space="preserve">Roasting equipment (sample roaster)</w:t>
+              <w:t xml:space="preserve">Warehouse/storage (deposit + fit-out)</w:t>
             </w:r>
           </w:p>
         </w:tc>
@@ -2012,7 +1992,7 @@
                 <w:sz w:val="20"/>
                 <w:szCs w:val="20"/>
               </w:rPr>
-              <w:t xml:space="preserve">$0 (buy pre-roasted)</w:t>
+              <w:t xml:space="preserve">AED 0 (home-based)</w:t>
             </w:r>
           </w:p>
         </w:tc>
@@ -2039,7 +2019,7 @@
                 <w:sz w:val="20"/>
                 <w:szCs w:val="20"/>
               </w:rPr>
-              <w:t xml:space="preserve">$0–$3,000 (optional)</w:t>
+              <w:t xml:space="preserve">AED 12,000</w:t>
             </w:r>
           </w:p>
         </w:tc>
@@ -2066,7 +2046,7 @@
                 <w:sz w:val="20"/>
                 <w:szCs w:val="20"/>
               </w:rPr>
-              <w:t xml:space="preserve">$15,000–25,000</w:t>
+              <w:t xml:space="preserve">AED 40,000</w:t>
             </w:r>
           </w:p>
         </w:tc>
@@ -2095,7 +2075,7 @@
                 <w:sz w:val="20"/>
                 <w:szCs w:val="20"/>
               </w:rPr>
-              <w:t xml:space="preserve">Business registration, insurance, misc.</w:t>
+              <w:t xml:space="preserve">Delivery/courier integration &amp; first-month float</w:t>
             </w:r>
           </w:p>
         </w:tc>
@@ -2122,7 +2102,7 @@
                 <w:sz w:val="20"/>
                 <w:szCs w:val="20"/>
               </w:rPr>
-              <w:t xml:space="preserve">$300</w:t>
+              <w:t xml:space="preserve">AED 1,500</w:t>
             </w:r>
           </w:p>
         </w:tc>
@@ -2149,7 +2129,7 @@
                 <w:sz w:val="20"/>
                 <w:szCs w:val="20"/>
               </w:rPr>
-              <w:t xml:space="preserve">$800</w:t>
+              <w:t xml:space="preserve">AED 8,000</w:t>
             </w:r>
           </w:p>
         </w:tc>
@@ -2176,7 +2156,7 @@
                 <w:sz w:val="20"/>
                 <w:szCs w:val="20"/>
               </w:rPr>
-              <w:t xml:space="preserve">$2,000</w:t>
+              <w:t xml:space="preserve">AED 25,000</w:t>
             </w:r>
           </w:p>
         </w:tc>
@@ -2205,7 +2185,7 @@
                 <w:sz w:val="20"/>
                 <w:szCs w:val="20"/>
               </w:rPr>
-              <w:t xml:space="preserve">Working capital buffer</w:t>
+              <w:t xml:space="preserve">Insurance &amp; misc.</w:t>
             </w:r>
           </w:p>
         </w:tc>
@@ -2232,7 +2212,7 @@
                 <w:sz w:val="20"/>
                 <w:szCs w:val="20"/>
               </w:rPr>
-              <w:t xml:space="preserve">$500</w:t>
+              <w:t xml:space="preserve">AED 800</w:t>
             </w:r>
           </w:p>
         </w:tc>
@@ -2259,7 +2239,7 @@
                 <w:sz w:val="20"/>
                 <w:szCs w:val="20"/>
               </w:rPr>
-              <w:t xml:space="preserve">$4,500</w:t>
+              <w:t xml:space="preserve">AED 3,000</w:t>
             </w:r>
           </w:p>
         </w:tc>
@@ -2286,7 +2266,7 @@
                 <w:sz w:val="20"/>
                 <w:szCs w:val="20"/>
               </w:rPr>
-              <w:t xml:space="preserve">$14,000+</w:t>
+              <w:t xml:space="preserve">AED 8,000</w:t>
             </w:r>
           </w:p>
         </w:tc>
@@ -2315,6 +2295,116 @@
                 <w:sz w:val="20"/>
                 <w:szCs w:val="20"/>
               </w:rPr>
+              <w:t xml:space="preserve">Working capital buffer</w:t>
+            </w:r>
+          </w:p>
+        </w:tc>
+        <w:tc>
+          <w:tcPr>
+            <w:tcW w:type="dxa" w:w="2100"/>
+            <w:shd w:fill="FFFFFF" w:val="clear"/>
+            <w:tcMar>
+              <w:top w:type="dxa" w:w="80"/>
+              <w:left w:type="dxa" w:w="100"/>
+              <w:bottom w:type="dxa" w:w="80"/>
+              <w:right w:type="dxa" w:w="100"/>
+            </w:tcMar>
+          </w:tcPr>
+          <w:p>
+            <w:pPr>
+              <w:jc w:val="right"/>
+            </w:pPr>
+            <w:r>
+              <w:rPr>
+                <w:b w:val="false"/>
+                <w:bCs w:val="false"/>
+                <w:color w:val="222222"/>
+                <w:sz w:val="20"/>
+                <w:szCs w:val="20"/>
+              </w:rPr>
+              <w:t xml:space="preserve">AED 2,500</w:t>
+            </w:r>
+          </w:p>
+        </w:tc>
+        <w:tc>
+          <w:tcPr>
+            <w:tcW w:type="dxa" w:w="2100"/>
+            <w:shd w:fill="FFFFFF" w:val="clear"/>
+            <w:tcMar>
+              <w:top w:type="dxa" w:w="80"/>
+              <w:left w:type="dxa" w:w="100"/>
+              <w:bottom w:type="dxa" w:w="80"/>
+              <w:right w:type="dxa" w:w="100"/>
+            </w:tcMar>
+          </w:tcPr>
+          <w:p>
+            <w:pPr>
+              <w:jc w:val="right"/>
+            </w:pPr>
+            <w:r>
+              <w:rPr>
+                <w:b w:val="false"/>
+                <w:bCs w:val="false"/>
+                <w:color w:val="222222"/>
+                <w:sz w:val="20"/>
+                <w:szCs w:val="20"/>
+              </w:rPr>
+              <w:t xml:space="preserve">AED 15,000</w:t>
+            </w:r>
+          </w:p>
+        </w:tc>
+        <w:tc>
+          <w:tcPr>
+            <w:tcW w:type="dxa" w:w="2100"/>
+            <w:shd w:fill="FFFFFF" w:val="clear"/>
+            <w:tcMar>
+              <w:top w:type="dxa" w:w="80"/>
+              <w:left w:type="dxa" w:w="100"/>
+              <w:bottom w:type="dxa" w:w="80"/>
+              <w:right w:type="dxa" w:w="100"/>
+            </w:tcMar>
+          </w:tcPr>
+          <w:p>
+            <w:pPr>
+              <w:jc w:val="right"/>
+            </w:pPr>
+            <w:r>
+              <w:rPr>
+                <w:b w:val="false"/>
+                <w:bCs w:val="false"/>
+                <w:color w:val="222222"/>
+                <w:sz w:val="20"/>
+                <w:szCs w:val="20"/>
+              </w:rPr>
+              <w:t xml:space="preserve">AED 60,000</w:t>
+            </w:r>
+          </w:p>
+        </w:tc>
+      </w:tr>
+      <w:tr>
+        <w:tc>
+          <w:tcPr>
+            <w:tcW w:type="dxa" w:w="3600"/>
+            <w:shd w:fill="F4EFE6" w:val="clear"/>
+            <w:tcMar>
+              <w:top w:type="dxa" w:w="80"/>
+              <w:left w:type="dxa" w:w="100"/>
+              <w:bottom w:type="dxa" w:w="80"/>
+              <w:right w:type="dxa" w:w="100"/>
+            </w:tcMar>
+          </w:tcPr>
+          <w:p>
+            <w:pPr>
+              <w:jc w:val="left"/>
+            </w:pPr>
+            <w:r>
+              <w:rPr>
+                <w:b w:val="false"/>
+                <w:bCs w:val="false"/>
+                <w:color w:val="222222"/>
+                <w:sz w:val="20"/>
+                <w:szCs w:val="20"/>
+              </w:rPr>
               <w:t xml:space="preserve">Approx. total</w:t>
             </w:r>
           </w:p>
@@ -2322,81 +2412,81 @@
         <w:tc>
           <w:tcPr>
             <w:tcW w:type="dxa" w:w="2100"/>
-            <w:shd w:fill="FFFFFF" w:val="clear"/>
-            <w:tcMar>
-              <w:top w:type="dxa" w:w="80"/>
-              <w:left w:type="dxa" w:w="100"/>
-              <w:bottom w:type="dxa" w:w="80"/>
-              <w:right w:type="dxa" w:w="100"/>
-            </w:tcMar>
-          </w:tcPr>
-          <w:p>
-            <w:pPr>
-              <w:jc w:val="right"/>
-            </w:pPr>
-            <w:r>
-              <w:rPr>
-                <w:b w:val="false"/>
-                <w:bCs w:val="false"/>
-                <w:color w:val="222222"/>
-                <w:sz w:val="20"/>
-                <w:szCs w:val="20"/>
-              </w:rPr>
-              <w:t xml:space="preserve">$3,200</w:t>
-            </w:r>
-          </w:p>
-        </w:tc>
-        <w:tc>
-          <w:tcPr>
-            <w:tcW w:type="dxa" w:w="2100"/>
-            <w:shd w:fill="FFFFFF" w:val="clear"/>
-            <w:tcMar>
-              <w:top w:type="dxa" w:w="80"/>
-              <w:left w:type="dxa" w:w="100"/>
-              <w:bottom w:type="dxa" w:w="80"/>
-              <w:right w:type="dxa" w:w="100"/>
-            </w:tcMar>
-          </w:tcPr>
-          <w:p>
-            <w:pPr>
-              <w:jc w:val="right"/>
-            </w:pPr>
-            <w:r>
-              <w:rPr>
-                <w:b w:val="false"/>
-                <w:bCs w:val="false"/>
-                <w:color w:val="222222"/>
-                <w:sz w:val="20"/>
-                <w:szCs w:val="20"/>
-              </w:rPr>
-              <w:t xml:space="preserve">$19,500–$22,500</w:t>
-            </w:r>
-          </w:p>
-        </w:tc>
-        <w:tc>
-          <w:tcPr>
-            <w:tcW w:type="dxa" w:w="2100"/>
-            <w:shd w:fill="FFFFFF" w:val="clear"/>
-            <w:tcMar>
-              <w:top w:type="dxa" w:w="80"/>
-              <w:left w:type="dxa" w:w="100"/>
-              <w:bottom w:type="dxa" w:w="80"/>
-              <w:right w:type="dxa" w:w="100"/>
-            </w:tcMar>
-          </w:tcPr>
-          <w:p>
-            <w:pPr>
-              <w:jc w:val="right"/>
-            </w:pPr>
-            <w:r>
-              <w:rPr>
-                <w:b w:val="false"/>
-                <w:bCs w:val="false"/>
-                <w:color w:val="222222"/>
-                <w:sz w:val="20"/>
-                <w:szCs w:val="20"/>
-              </w:rPr>
-              <w:t xml:space="preserve">$74,600–$84,600</w:t>
+            <w:shd w:fill="F4EFE6" w:val="clear"/>
+            <w:tcMar>
+              <w:top w:type="dxa" w:w="80"/>
+              <w:left w:type="dxa" w:w="100"/>
+              <w:bottom w:type="dxa" w:w="80"/>
+              <w:right w:type="dxa" w:w="100"/>
+            </w:tcMar>
+          </w:tcPr>
+          <w:p>
+            <w:pPr>
+              <w:jc w:val="right"/>
+            </w:pPr>
+            <w:r>
+              <w:rPr>
+                <w:b w:val="false"/>
+                <w:bCs w:val="false"/>
+                <w:color w:val="222222"/>
+                <w:sz w:val="20"/>
+                <w:szCs w:val="20"/>
+              </w:rPr>
+              <w:t xml:space="preserve">AED 16,300</w:t>
+            </w:r>
+          </w:p>
+        </w:tc>
+        <w:tc>
+          <w:tcPr>
+            <w:tcW w:type="dxa" w:w="2100"/>
+            <w:shd w:fill="F4EFE6" w:val="clear"/>
+            <w:tcMar>
+              <w:top w:type="dxa" w:w="80"/>
+              <w:left w:type="dxa" w:w="100"/>
+              <w:bottom w:type="dxa" w:w="80"/>
+              <w:right w:type="dxa" w:w="100"/>
+            </w:tcMar>
+          </w:tcPr>
+          <w:p>
+            <w:pPr>
+              <w:jc w:val="right"/>
+            </w:pPr>
+            <w:r>
+              <w:rPr>
+                <w:b w:val="false"/>
+                <w:bCs w:val="false"/>
+                <w:color w:val="222222"/>
+                <w:sz w:val="20"/>
+                <w:szCs w:val="20"/>
+              </w:rPr>
+              <w:t xml:space="preserve">AED 96,000</w:t>
+            </w:r>
+          </w:p>
+        </w:tc>
+        <w:tc>
+          <w:tcPr>
+            <w:tcW w:type="dxa" w:w="2100"/>
+            <w:shd w:fill="F4EFE6" w:val="clear"/>
+            <w:tcMar>
+              <w:top w:type="dxa" w:w="80"/>
+              <w:left w:type="dxa" w:w="100"/>
+              <w:bottom w:type="dxa" w:w="80"/>
+              <w:right w:type="dxa" w:w="100"/>
+            </w:tcMar>
+          </w:tcPr>
+          <w:p>
+            <w:pPr>
+              <w:jc w:val="right"/>
+            </w:pPr>
+            <w:r>
+              <w:rPr>
+                <w:b w:val="false"/>
+                <w:bCs w:val="false"/>
+                <w:color w:val="222222"/>
+                <w:sz w:val="20"/>
+                <w:szCs w:val="20"/>
+              </w:rPr>
+              <w:t xml:space="preserve">AED 300,000</w:t>
             </w:r>
           </w:p>
         </w:tc>
@@ -2428,7 +2518,7 @@
           <w:sz w:val="21"/>
           <w:szCs w:val="21"/>
         </w:rPr>
-        <w:t xml:space="preserve">Example on a 12oz (340g) bag of beans, once past the pre-roasted-supplier stage:</w:t>
+        <w:t xml:space="preserve">Example on a 250g bag sourced from a partner roaster on consignment:</w:t>
       </w:r>
     </w:p>
     <w:tbl>
@@ -2527,7 +2617,7 @@
                 <w:sz w:val="20"/>
                 <w:szCs w:val="20"/>
               </w:rPr>
-              <w:t xml:space="preserve">Retail price</w:t>
+              <w:t xml:space="preserve">Retail price (incl. 5% VAT)</w:t>
             </w:r>
           </w:p>
         </w:tc>
@@ -2554,7 +2644,7 @@
                 <w:sz w:val="20"/>
                 <w:szCs w:val="20"/>
               </w:rPr>
-              <w:t xml:space="preserve">$18.00</w:t>
+              <w:t xml:space="preserve">AED 55.00</w:t>
             </w:r>
           </w:p>
         </w:tc>
@@ -2583,7 +2673,7 @@
                 <w:sz w:val="20"/>
                 <w:szCs w:val="20"/>
               </w:rPr>
-              <w:t xml:space="preserve">Cost of beans (wholesale/private-label)</w:t>
+              <w:t xml:space="preserve">Roaster's consignment cost (~55% of ex-VAT price)</w:t>
             </w:r>
           </w:p>
         </w:tc>
@@ -2610,7 +2700,7 @@
                 <w:sz w:val="20"/>
                 <w:szCs w:val="20"/>
               </w:rPr>
-              <w:t xml:space="preserve">$5.50</w:t>
+              <w:t xml:space="preserve">AED 28.80</w:t>
             </w:r>
           </w:p>
         </w:tc>
@@ -2639,7 +2729,7 @@
                 <w:sz w:val="20"/>
                 <w:szCs w:val="20"/>
               </w:rPr>
-              <w:t xml:space="preserve">Packaging &amp; label</w:t>
+              <w:t xml:space="preserve">Packaging &amp; outer box (shared across order)</w:t>
             </w:r>
           </w:p>
         </w:tc>
@@ -2666,7 +2756,7 @@
                 <w:sz w:val="20"/>
                 <w:szCs w:val="20"/>
               </w:rPr>
-              <w:t xml:space="preserve">$0.80</w:t>
+              <w:t xml:space="preserve">AED 3.50</w:t>
             </w:r>
           </w:p>
         </w:tc>
@@ -2695,7 +2785,7 @@
                 <w:sz w:val="20"/>
                 <w:szCs w:val="20"/>
               </w:rPr>
-              <w:t xml:space="preserve">Shipping cost (subsidized in price)</w:t>
+              <w:t xml:space="preserve">Delivery cost (blended, absorbed into price)</w:t>
             </w:r>
           </w:p>
         </w:tc>
@@ -2722,7 +2812,7 @@
                 <w:sz w:val="20"/>
                 <w:szCs w:val="20"/>
               </w:rPr>
-              <w:t xml:space="preserve">$4.50</w:t>
+              <w:t xml:space="preserve">AED 9.00</w:t>
             </w:r>
           </w:p>
         </w:tc>
@@ -2751,7 +2841,7 @@
                 <w:sz w:val="20"/>
                 <w:szCs w:val="20"/>
               </w:rPr>
-              <w:t xml:space="preserve">Payment processing (~3%)</w:t>
+              <w:t xml:space="preserve">Payment gateway fee (~2.5%)</w:t>
             </w:r>
           </w:p>
         </w:tc>
@@ -2778,7 +2868,7 @@
                 <w:sz w:val="20"/>
                 <w:szCs w:val="20"/>
               </w:rPr>
-              <w:t xml:space="preserve">$0.55</w:t>
+              <w:t xml:space="preserve">AED 1.30</w:t>
             </w:r>
           </w:p>
         </w:tc>
@@ -2834,7 +2924,7 @@
                 <w:sz w:val="20"/>
                 <w:szCs w:val="20"/>
               </w:rPr>
-              <w:t xml:space="preserve">$6.65 (37%)</w:t>
+              <w:t xml:space="preserve">AED 12.40 (~23%)</w:t>
             </w:r>
           </w:p>
         </w:tc>
@@ -2850,7 +2940,7 @@
           <w:sz w:val="21"/>
           <w:szCs w:val="21"/>
         </w:rPr>
-        <w:t xml:space="preserve">Essentials typically carry thinner margins on hardware (20–35%) but lift average order value — the starter-kit bundle (beans + brewer + filters) is designed to keep blended margin healthy while giving new customers everything they need in one order.</w:t>
+        <w:t xml:space="preserve">Margins are thinner than a house-roasted model because the roaster takes the largest share — this is the tradeoff for zero manufacturing risk. The Discovery Sampler carries a lower absolute margin per bag but a higher conversion rate, and is priced primarily to acquire a customer, not to profit on the first order.</w:t>
       </w:r>
     </w:p>
     <w:p>
@@ -2884,7 +2974,7 @@
           <w:sz w:val="21"/>
           <w:szCs w:val="21"/>
         </w:rPr>
-        <w:t xml:space="preserve">Lean tier: roughly 480 bags sold (about 40/month) to recover the ~$3,200 startup cost at $6.65 gross margin/bag — realistic within the first 6–9 months for a part-time online operation.</w:t>
+        <w:t xml:space="preserve">Lean tier: roughly 1,300 bags sold (about 110/month) to recover the ~AED 16,300 startup cost at AED 12.40 gross margin/bag — realistic within 9–12 months for a part-time, home-based operation with 5–8 roaster partners.</w:t>
       </w:r>
     </w:p>
     <w:p>
@@ -2902,7 +2992,7 @@
           <w:sz w:val="21"/>
           <w:szCs w:val="21"/>
         </w:rPr>
-        <w:t xml:space="preserve">Moderate tier: higher fixed spend on marketing and inventory is recovered faster in absolute revenue terms because paid acquisition accelerates order volume; target break-even within 9–12 months.</w:t>
+        <w:t xml:space="preserve">Moderate tier: higher marketing spend accelerates order volume and roaster-roster growth, which is the main lever on total margin (more SKUs → more comparison value → higher conversion); target break-even within 10–14 months.</w:t>
       </w:r>
     </w:p>
     <w:p>
@@ -2920,7 +3010,7 @@
           <w:sz w:val="21"/>
           <w:szCs w:val="21"/>
         </w:rPr>
-        <w:t xml:space="preserve">Track monthly recurring revenue (MRR) from subscriptions specifically — it is the strongest predictor of whether the business is compounding rather than restarting from zero customer acquisition every month.</w:t>
+        <w:t xml:space="preserve">Track two numbers monthly beyond revenue: number of active roaster partners (catalog breadth is the product) and repeat-purchase rate within 60 days (the real test of whether comparison shopping beats loyalty to one roaster).</w:t>
       </w:r>
     </w:p>
     <w:p>
@@ -2957,7 +3047,7 @@
           <w:sz w:val="21"/>
           <w:szCs w:val="21"/>
         </w:rPr>
-        <w:t xml:space="preserve">Days 1–15: Pick and register a business name; choose e-commerce platform; identify 1–2 candidate bean suppliers/roasters and 2–3 essentials suppliers; request samples.</w:t>
+        <w:t xml:space="preserve">Days 1–15: Register the free-zone e-commerce license; approach 8–12 candidate UAE roasters with a consignment-partnership pitch; aim to sign 5–8.</w:t>
       </w:r>
     </w:p>
     <w:p>
@@ -2975,7 +3065,7 @@
           <w:sz w:val="21"/>
           <w:szCs w:val="21"/>
         </w:rPr>
-        <w:t xml:space="preserve">Days 16–30: Finalize product line (3–4 bean SKUs, 4–6 essentials SKUs, 1 starter bundle); design packaging/labels; build the storefront; write brewing-guide content.</w:t>
+        <w:t xml:space="preserve">Days 16–30: Finalize the launch catalog (one flagship bag per roaster, placed on the roast line); build the bilingual storefront; set up one courier for Dubai and one for UAE-wide.</w:t>
       </w:r>
     </w:p>
     <w:p>
@@ -2993,7 +3083,7 @@
           <w:sz w:val="21"/>
           <w:szCs w:val="21"/>
         </w:rPr>
-        <w:t xml:space="preserve">Days 31–45: Soft-launch to an email list / personal network at a founding-customer discount; collect feedback on taste, packaging, and shipping speed.</w:t>
+        <w:t xml:space="preserve">Days 31–45: Soft-launch to a personal network and each partner roaster's audience at a founding-customer discount; collect feedback on delivery speed and packaging.</w:t>
       </w:r>
     </w:p>
     <w:p>
@@ -3011,7 +3101,7 @@
           <w:sz w:val="21"/>
           <w:szCs w:val="21"/>
         </w:rPr>
-        <w:t xml:space="preserve">Days 46–60: Public launch across social channels; turn on the subscription option; start light paid social spend if Moderate/Growth tier.</w:t>
+        <w:t xml:space="preserve">Days 46–60: Public launch across Instagram/TikTok in both languages; push the Discovery Sampler as the primary paid-acquisition offer.</w:t>
       </w:r>
     </w:p>
     <w:p>
@@ -3029,7 +3119,7 @@
           <w:sz w:val="21"/>
           <w:szCs w:val="21"/>
         </w:rPr>
-        <w:t xml:space="preserve">Days 61–90: Review sales by SKU, cut underperformers, double down on what's reordering; decide whether to move toward in-house roasting or stay with a private-label supplier.</w:t>
+        <w:t xml:space="preserve">Days 61–90: Review sales by roaster and SKU; renegotiate or drop underperforming partners; decide whether to add 3–5 more roasters or deepen inventory with the current roster.</w:t>
       </w:r>
     </w:p>
     <w:p>
@@ -3066,7 +3156,7 @@
           <w:sz w:val="21"/>
           <w:szCs w:val="21"/>
         </w:rPr>
-        <w:t xml:space="preserve">Freshness/quality inconsistency from a third-party roaster — mitigate by auditing roast dates and testing every batch before it ships to customers.</w:t>
+        <w:t xml:space="preserve">Roaster freshness/consistency outside direct control — mitigate with a hard shelf-life cap per partner and spot-checking batches before they're listed.</w:t>
       </w:r>
     </w:p>
     <w:p>
@@ -3084,7 +3174,7 @@
           <w:sz w:val="21"/>
           <w:szCs w:val="21"/>
         </w:rPr>
-        <w:t xml:space="preserve">Thin margins on shipping heavy/bulky items (bags of beans, brewers) — mitigate with bundle pricing and a free-shipping threshold tuned to protect margin.</w:t>
+        <w:t xml:space="preserve">Thin consignment margins limiting paid-acquisition budget — mitigate by shifting fast-moving SKUs to wholesale purchase (better margin) once sales data supports the cash commitment.</w:t>
       </w:r>
     </w:p>
     <w:p>
@@ -3102,7 +3192,7 @@
           <w:sz w:val="21"/>
           <w:szCs w:val="21"/>
         </w:rPr>
-        <w:t xml:space="preserve">Customer acquisition cost exceeding lifetime value — mitigate by prioritizing the subscription and content/SEO channels, which compound, over pure paid ads early on.</w:t>
+        <w:t xml:space="preserve">Roaster channel conflict — a partner may worry the marketplace cannibalizes their own site; mitigate by pitching it explicitly as incremental distribution (their audience plus the marketplace's), not a replacement.</w:t>
       </w:r>
     </w:p>
     <w:p>
@@ -3120,7 +3210,7 @@
           <w:sz w:val="21"/>
           <w:szCs w:val="21"/>
         </w:rPr>
-        <w:t xml:space="preserve">Regulatory/food-handling requirements varying by region — confirm local rules before the public launch, not after.</w:t>
+        <w:t xml:space="preserve">Delivery cost eating margin on small orders — mitigate with a minimum order value for free/absorbed delivery, tuned once real courier rates are confirmed.</w:t>
       </w:r>
     </w:p>
     <w:p>
@@ -3152,7 +3242,7 @@
           <w:sz w:val="21"/>
           <w:szCs w:val="21"/>
         </w:rPr>
-        <w:t xml:space="preserve">This document is a working draft intended to be edited as decisions firm up (business name, exact budget, home region). The next concrete step is choosing the e-commerce platform and requesting samples from 2–3 candidate bean suppliers so the product line can be finalized within the first two weeks.</w:t>
+        <w:t xml:space="preserve">This document is a working draft intended to be edited as decisions firm up (final business name, confirmed roaster partners, exact budget tier). The next concrete step is approaching 8–12 UAE specialty roasters with the consignment-partnership pitch, since the catalog — not the storefront — is what the business actually depends on.</w:t>
       </w:r>
     </w:p>
     <w:sectPr>

</xml_diff>